<commit_message>
Add second DOT template and uppercase casing to county names in previous templates
</commit_message>
<xml_diff>
--- a/templates/Note_and_DOT_RARE__Template.docx
+++ b/templates/Note_and_DOT_RARE__Template.docx
@@ -4820,7 +4820,21 @@
               <w:t xml:space="preserve"> </w:t>
             </w:r>
             <w:r>
-              <w:t>{{Name}}</w:t>
+              <w:t>{{</w:t>
+            </w:r>
+            <w:proofErr w:type="spellStart"/>
+            <w:r>
+              <w:t>Name</w:t>
+            </w:r>
+            <w:r>
+              <w:t>|upper</w:t>
+            </w:r>
+            <w:proofErr w:type="spellEnd"/>
+            <w:r>
+              <w:t xml:space="preserve"> </w:t>
+            </w:r>
+            <w:r>
+              <w:t>}}</w:t>
             </w:r>
           </w:p>
         </w:tc>

</xml_diff>